<commit_message>
daylis 1 sprint 3
</commit_message>
<xml_diff>
--- a/Fase dos/Sptints1234/Sprint 3/Daylis/Dailys 1- Sprint 3.docx
+++ b/Fase dos/Sptints1234/Sprint 3/Daylis/Dailys 1- Sprint 3.docx
@@ -108,13 +108,8 @@
           <w:numId w:val="8"/>
         </w:numPr>
       </w:pPr>
-      <w:proofErr w:type="spellStart"/>
       <w:r>
-        <w:t>Dailys</w:t>
-      </w:r>
-      <w:proofErr w:type="spellEnd"/>
-      <w:r>
-        <w:t xml:space="preserve"> </w:t>
+        <w:t xml:space="preserve">Dailys </w:t>
       </w:r>
       <w:r>
         <w:t>1</w:t>
@@ -156,15 +151,7 @@
         <w:t>Israel Muñoz</w:t>
       </w:r>
       <w:r>
-        <w:t xml:space="preserve"> (</w:t>
-      </w:r>
-      <w:proofErr w:type="spellStart"/>
-      <w:r>
-        <w:t>Product</w:t>
-      </w:r>
-      <w:proofErr w:type="spellEnd"/>
-      <w:r>
-        <w:t xml:space="preserve"> Owner / desarrollador)</w:t>
+        <w:t xml:space="preserve"> (Product Owner / desarrollador)</w:t>
       </w:r>
     </w:p>
     <w:p>
@@ -228,7 +215,34 @@
     <w:p>
       <w:pPr>
         <w:pStyle w:val="Prrafodelista"/>
+        <w:numPr>
+          <w:ilvl w:val="0"/>
+          <w:numId w:val="22"/>
+        </w:numPr>
+        <w:rPr>
+          <w:lang w:val="en-US"/>
+        </w:rPr>
+      </w:pPr>
+      <w:r>
+        <w:rPr>
+          <w:lang w:val="en-US"/>
+        </w:rPr>
+        <w:t xml:space="preserve">Sprint Planning,Retroespective,Review y </w:t>
+      </w:r>
+      <w:r>
+        <w:rPr>
+          <w:lang w:val="en-US"/>
+        </w:rPr>
+        <w:t>realse</w:t>
+      </w:r>
+    </w:p>
+    <w:p>
+      <w:pPr>
+        <w:pStyle w:val="Prrafodelista"/>
         <w:ind w:left="1428"/>
+        <w:rPr>
+          <w:lang w:val="en-US"/>
+        </w:rPr>
       </w:pPr>
     </w:p>
     <w:p>
@@ -257,26 +271,52 @@
     <w:p>
       <w:pPr>
         <w:pStyle w:val="Prrafodelista"/>
-        <w:ind w:left="1776"/>
-      </w:pPr>
+        <w:numPr>
+          <w:ilvl w:val="0"/>
+          <w:numId w:val="22"/>
+        </w:numPr>
+      </w:pPr>
+      <w:r>
+        <w:t>Como Administrador necesito registrar y gestionar las multas de los usuarios</w:t>
+      </w:r>
     </w:p>
     <w:p>
       <w:pPr>
         <w:pStyle w:val="Prrafodelista"/>
-        <w:ind w:left="1776"/>
-      </w:pPr>
+        <w:numPr>
+          <w:ilvl w:val="0"/>
+          <w:numId w:val="22"/>
+        </w:numPr>
+        <w:rPr>
+          <w:rFonts w:cstheme="minorHAnsi"/>
+        </w:rPr>
+      </w:pPr>
+      <w:r>
+        <w:rPr>
+          <w:rFonts w:cstheme="minorHAnsi"/>
+          <w:color w:val="292A2E"/>
+        </w:rPr>
+        <w:t>Como Administrador necesito registrar las multas por cobrar a los usuarios y que se le notifique al usuario</w:t>
+      </w:r>
     </w:p>
     <w:p>
       <w:pPr>
         <w:pStyle w:val="Prrafodelista"/>
-        <w:ind w:left="1776"/>
-      </w:pPr>
-    </w:p>
-    <w:p>
-      <w:pPr>
-        <w:pStyle w:val="Prrafodelista"/>
-        <w:ind w:left="1440"/>
-      </w:pPr>
+        <w:numPr>
+          <w:ilvl w:val="0"/>
+          <w:numId w:val="22"/>
+        </w:numPr>
+        <w:rPr>
+          <w:rFonts w:cstheme="minorHAnsi"/>
+        </w:rPr>
+      </w:pPr>
+      <w:r>
+        <w:rPr>
+          <w:rFonts w:cstheme="minorHAnsi"/>
+          <w:color w:val="292A2E"/>
+        </w:rPr>
+        <w:t>Como Administrador necesito enviar los gastos comunes el día de la facturación</w:t>
+      </w:r>
     </w:p>
     <w:p>
       <w:pPr>
@@ -1607,6 +1647,118 @@
     </w:lvl>
   </w:abstractNum>
   <w:abstractNum w:abstractNumId="9" w15:restartNumberingAfterBreak="0">
+    <w:nsid w:val="33E34035"/>
+    <w:multiLevelType w:val="hybridMultilevel"/>
+    <w:tmpl w:val="831EB2CE"/>
+    <w:lvl w:ilvl="0" w:tplc="37DA31B2">
+      <w:numFmt w:val="bullet"/>
+      <w:lvlText w:val="-"/>
+      <w:lvlJc w:val="left"/>
+      <w:pPr>
+        <w:ind w:left="1080" w:hanging="360"/>
+      </w:pPr>
+      <w:rPr>
+        <w:rFonts w:ascii="Calibri" w:eastAsiaTheme="minorHAnsi" w:hAnsi="Calibri" w:cs="Calibri" w:hint="default"/>
+      </w:rPr>
+    </w:lvl>
+    <w:lvl w:ilvl="1" w:tplc="340A0003" w:tentative="1">
+      <w:start w:val="1"/>
+      <w:numFmt w:val="bullet"/>
+      <w:lvlText w:val="o"/>
+      <w:lvlJc w:val="left"/>
+      <w:pPr>
+        <w:ind w:left="1800" w:hanging="360"/>
+      </w:pPr>
+      <w:rPr>
+        <w:rFonts w:ascii="Courier New" w:hAnsi="Courier New" w:cs="Courier New" w:hint="default"/>
+      </w:rPr>
+    </w:lvl>
+    <w:lvl w:ilvl="2" w:tplc="340A0005" w:tentative="1">
+      <w:start w:val="1"/>
+      <w:numFmt w:val="bullet"/>
+      <w:lvlText w:val=""/>
+      <w:lvlJc w:val="left"/>
+      <w:pPr>
+        <w:ind w:left="2520" w:hanging="360"/>
+      </w:pPr>
+      <w:rPr>
+        <w:rFonts w:ascii="Wingdings" w:hAnsi="Wingdings" w:hint="default"/>
+      </w:rPr>
+    </w:lvl>
+    <w:lvl w:ilvl="3" w:tplc="340A0001" w:tentative="1">
+      <w:start w:val="1"/>
+      <w:numFmt w:val="bullet"/>
+      <w:lvlText w:val=""/>
+      <w:lvlJc w:val="left"/>
+      <w:pPr>
+        <w:ind w:left="3240" w:hanging="360"/>
+      </w:pPr>
+      <w:rPr>
+        <w:rFonts w:ascii="Symbol" w:hAnsi="Symbol" w:hint="default"/>
+      </w:rPr>
+    </w:lvl>
+    <w:lvl w:ilvl="4" w:tplc="340A0003" w:tentative="1">
+      <w:start w:val="1"/>
+      <w:numFmt w:val="bullet"/>
+      <w:lvlText w:val="o"/>
+      <w:lvlJc w:val="left"/>
+      <w:pPr>
+        <w:ind w:left="3960" w:hanging="360"/>
+      </w:pPr>
+      <w:rPr>
+        <w:rFonts w:ascii="Courier New" w:hAnsi="Courier New" w:cs="Courier New" w:hint="default"/>
+      </w:rPr>
+    </w:lvl>
+    <w:lvl w:ilvl="5" w:tplc="340A0005" w:tentative="1">
+      <w:start w:val="1"/>
+      <w:numFmt w:val="bullet"/>
+      <w:lvlText w:val=""/>
+      <w:lvlJc w:val="left"/>
+      <w:pPr>
+        <w:ind w:left="4680" w:hanging="360"/>
+      </w:pPr>
+      <w:rPr>
+        <w:rFonts w:ascii="Wingdings" w:hAnsi="Wingdings" w:hint="default"/>
+      </w:rPr>
+    </w:lvl>
+    <w:lvl w:ilvl="6" w:tplc="340A0001" w:tentative="1">
+      <w:start w:val="1"/>
+      <w:numFmt w:val="bullet"/>
+      <w:lvlText w:val=""/>
+      <w:lvlJc w:val="left"/>
+      <w:pPr>
+        <w:ind w:left="5400" w:hanging="360"/>
+      </w:pPr>
+      <w:rPr>
+        <w:rFonts w:ascii="Symbol" w:hAnsi="Symbol" w:hint="default"/>
+      </w:rPr>
+    </w:lvl>
+    <w:lvl w:ilvl="7" w:tplc="340A0003" w:tentative="1">
+      <w:start w:val="1"/>
+      <w:numFmt w:val="bullet"/>
+      <w:lvlText w:val="o"/>
+      <w:lvlJc w:val="left"/>
+      <w:pPr>
+        <w:ind w:left="6120" w:hanging="360"/>
+      </w:pPr>
+      <w:rPr>
+        <w:rFonts w:ascii="Courier New" w:hAnsi="Courier New" w:cs="Courier New" w:hint="default"/>
+      </w:rPr>
+    </w:lvl>
+    <w:lvl w:ilvl="8" w:tplc="340A0005" w:tentative="1">
+      <w:start w:val="1"/>
+      <w:numFmt w:val="bullet"/>
+      <w:lvlText w:val=""/>
+      <w:lvlJc w:val="left"/>
+      <w:pPr>
+        <w:ind w:left="6840" w:hanging="360"/>
+      </w:pPr>
+      <w:rPr>
+        <w:rFonts w:ascii="Wingdings" w:hAnsi="Wingdings" w:hint="default"/>
+      </w:rPr>
+    </w:lvl>
+  </w:abstractNum>
+  <w:abstractNum w:abstractNumId="10" w15:restartNumberingAfterBreak="0">
     <w:nsid w:val="3A800526"/>
     <w:multiLevelType w:val="hybridMultilevel"/>
     <w:tmpl w:val="69A44368"/>
@@ -1719,7 +1871,7 @@
       </w:rPr>
     </w:lvl>
   </w:abstractNum>
-  <w:abstractNum w:abstractNumId="10" w15:restartNumberingAfterBreak="0">
+  <w:abstractNum w:abstractNumId="11" w15:restartNumberingAfterBreak="0">
     <w:nsid w:val="3CEE4742"/>
     <w:multiLevelType w:val="hybridMultilevel"/>
     <w:tmpl w:val="05CE1C5C"/>
@@ -1832,7 +1984,7 @@
       </w:rPr>
     </w:lvl>
   </w:abstractNum>
-  <w:abstractNum w:abstractNumId="11" w15:restartNumberingAfterBreak="0">
+  <w:abstractNum w:abstractNumId="12" w15:restartNumberingAfterBreak="0">
     <w:nsid w:val="410517C7"/>
     <w:multiLevelType w:val="hybridMultilevel"/>
     <w:tmpl w:val="A508D126"/>
@@ -1945,7 +2097,7 @@
       </w:rPr>
     </w:lvl>
   </w:abstractNum>
-  <w:abstractNum w:abstractNumId="12" w15:restartNumberingAfterBreak="0">
+  <w:abstractNum w:abstractNumId="13" w15:restartNumberingAfterBreak="0">
     <w:nsid w:val="43F0234D"/>
     <w:multiLevelType w:val="hybridMultilevel"/>
     <w:tmpl w:val="D212728C"/>
@@ -2058,7 +2210,7 @@
       </w:rPr>
     </w:lvl>
   </w:abstractNum>
-  <w:abstractNum w:abstractNumId="13" w15:restartNumberingAfterBreak="0">
+  <w:abstractNum w:abstractNumId="14" w15:restartNumberingAfterBreak="0">
     <w:nsid w:val="45C013EA"/>
     <w:multiLevelType w:val="hybridMultilevel"/>
     <w:tmpl w:val="45925B04"/>
@@ -2171,7 +2323,7 @@
       </w:rPr>
     </w:lvl>
   </w:abstractNum>
-  <w:abstractNum w:abstractNumId="14" w15:restartNumberingAfterBreak="0">
+  <w:abstractNum w:abstractNumId="15" w15:restartNumberingAfterBreak="0">
     <w:nsid w:val="479D2775"/>
     <w:multiLevelType w:val="hybridMultilevel"/>
     <w:tmpl w:val="74BCE514"/>
@@ -2260,7 +2412,7 @@
       </w:pPr>
     </w:lvl>
   </w:abstractNum>
-  <w:abstractNum w:abstractNumId="15" w15:restartNumberingAfterBreak="0">
+  <w:abstractNum w:abstractNumId="16" w15:restartNumberingAfterBreak="0">
     <w:nsid w:val="54CF6383"/>
     <w:multiLevelType w:val="multilevel"/>
     <w:tmpl w:val="B4C692C6"/>
@@ -2409,7 +2561,7 @@
       </w:rPr>
     </w:lvl>
   </w:abstractNum>
-  <w:abstractNum w:abstractNumId="16" w15:restartNumberingAfterBreak="0">
+  <w:abstractNum w:abstractNumId="17" w15:restartNumberingAfterBreak="0">
     <w:nsid w:val="57A05136"/>
     <w:multiLevelType w:val="hybridMultilevel"/>
     <w:tmpl w:val="E23EE3F0"/>
@@ -2522,7 +2674,7 @@
       </w:rPr>
     </w:lvl>
   </w:abstractNum>
-  <w:abstractNum w:abstractNumId="17" w15:restartNumberingAfterBreak="0">
+  <w:abstractNum w:abstractNumId="18" w15:restartNumberingAfterBreak="0">
     <w:nsid w:val="610A0626"/>
     <w:multiLevelType w:val="hybridMultilevel"/>
     <w:tmpl w:val="01C2B48C"/>
@@ -2635,7 +2787,7 @@
       </w:rPr>
     </w:lvl>
   </w:abstractNum>
-  <w:abstractNum w:abstractNumId="18" w15:restartNumberingAfterBreak="0">
+  <w:abstractNum w:abstractNumId="19" w15:restartNumberingAfterBreak="0">
     <w:nsid w:val="63476398"/>
     <w:multiLevelType w:val="hybridMultilevel"/>
     <w:tmpl w:val="FFD64270"/>
@@ -2748,7 +2900,7 @@
       </w:rPr>
     </w:lvl>
   </w:abstractNum>
-  <w:abstractNum w:abstractNumId="19" w15:restartNumberingAfterBreak="0">
+  <w:abstractNum w:abstractNumId="20" w15:restartNumberingAfterBreak="0">
     <w:nsid w:val="6D5C2985"/>
     <w:multiLevelType w:val="hybridMultilevel"/>
     <w:tmpl w:val="23B2D896"/>
@@ -2861,7 +3013,7 @@
       </w:rPr>
     </w:lvl>
   </w:abstractNum>
-  <w:abstractNum w:abstractNumId="20" w15:restartNumberingAfterBreak="0">
+  <w:abstractNum w:abstractNumId="21" w15:restartNumberingAfterBreak="0">
     <w:nsid w:val="76014403"/>
     <w:multiLevelType w:val="hybridMultilevel"/>
     <w:tmpl w:val="CA3A9AD0"/>
@@ -2975,28 +3127,28 @@
     </w:lvl>
   </w:abstractNum>
   <w:num w:numId="1" w16cid:durableId="1848516186">
-    <w:abstractNumId w:val="14"/>
+    <w:abstractNumId w:val="15"/>
   </w:num>
   <w:num w:numId="2" w16cid:durableId="290789372">
-    <w:abstractNumId w:val="11"/>
+    <w:abstractNumId w:val="12"/>
   </w:num>
   <w:num w:numId="3" w16cid:durableId="1214538422">
-    <w:abstractNumId w:val="16"/>
+    <w:abstractNumId w:val="17"/>
   </w:num>
   <w:num w:numId="4" w16cid:durableId="1792088254">
-    <w:abstractNumId w:val="19"/>
+    <w:abstractNumId w:val="20"/>
   </w:num>
   <w:num w:numId="5" w16cid:durableId="592981471">
     <w:abstractNumId w:val="0"/>
   </w:num>
   <w:num w:numId="6" w16cid:durableId="1186675827">
-    <w:abstractNumId w:val="12"/>
+    <w:abstractNumId w:val="13"/>
   </w:num>
   <w:num w:numId="7" w16cid:durableId="790634175">
-    <w:abstractNumId w:val="15"/>
+    <w:abstractNumId w:val="16"/>
   </w:num>
   <w:num w:numId="8" w16cid:durableId="1050491862">
-    <w:abstractNumId w:val="9"/>
+    <w:abstractNumId w:val="10"/>
   </w:num>
   <w:num w:numId="9" w16cid:durableId="1835796930">
     <w:abstractNumId w:val="2"/>
@@ -3005,25 +3157,25 @@
     <w:abstractNumId w:val="5"/>
   </w:num>
   <w:num w:numId="11" w16cid:durableId="250696478">
-    <w:abstractNumId w:val="18"/>
+    <w:abstractNumId w:val="19"/>
   </w:num>
   <w:num w:numId="12" w16cid:durableId="1398213079">
     <w:abstractNumId w:val="6"/>
   </w:num>
   <w:num w:numId="13" w16cid:durableId="908345920">
-    <w:abstractNumId w:val="17"/>
+    <w:abstractNumId w:val="18"/>
   </w:num>
   <w:num w:numId="14" w16cid:durableId="1053578397">
-    <w:abstractNumId w:val="13"/>
+    <w:abstractNumId w:val="14"/>
   </w:num>
   <w:num w:numId="15" w16cid:durableId="1779517951">
-    <w:abstractNumId w:val="20"/>
+    <w:abstractNumId w:val="21"/>
   </w:num>
   <w:num w:numId="16" w16cid:durableId="211041257">
     <w:abstractNumId w:val="7"/>
   </w:num>
   <w:num w:numId="17" w16cid:durableId="1687751217">
-    <w:abstractNumId w:val="10"/>
+    <w:abstractNumId w:val="11"/>
   </w:num>
   <w:num w:numId="18" w16cid:durableId="843545398">
     <w:abstractNumId w:val="1"/>
@@ -3036,6 +3188,9 @@
   </w:num>
   <w:num w:numId="21" w16cid:durableId="159391732">
     <w:abstractNumId w:val="3"/>
+  </w:num>
+  <w:num w:numId="22" w16cid:durableId="459569887">
+    <w:abstractNumId w:val="9"/>
   </w:num>
 </w:numbering>
 </file>
@@ -3466,7 +3621,6 @@
   <w:style w:type="character" w:default="1" w:styleId="Fuentedeprrafopredeter">
     <w:name w:val="Default Paragraph Font"/>
     <w:uiPriority w:val="1"/>
-    <w:semiHidden/>
     <w:unhideWhenUsed/>
   </w:style>
   <w:style w:type="table" w:default="1" w:styleId="Tablanormal">

</xml_diff>